<commit_message>
docs: keep Render previews alongside IONOS releases
</commit_message>
<xml_diff>
--- a/docs/replacement-app/deployment/handbuch.docx
+++ b/docs/replacement-app/deployment/handbuch.docx
@@ -474,7 +474,7 @@
     </w:p>
     <w:p>
       <w:r>
-        <w:t>In #117 Commit, Standort- und Vertragsnachweis, Domains, Betreiberkontakt, TLS- und Netztests, verwendeten CSV-Manifest-Checksum und Prüfergebnis ohne Secrets festhalten. Das Betriebskapitel an die zuständige Person übergeben. Render erst nach akzeptierter IONOS-Preview nach dem dort beschriebenen Ablauf außer Betrieb nehmen.</w:t>
+        <w:t>In #117 Commit, Standort- und Vertragsnachweis, Domains, Betreiberkontakt, TLS- und Netztests, verwendeten CSV-Manifest-Checksum und Prüfergebnis ohne Secrets festhalten. Das Betriebskapitel an die zuständige Person übergeben. Die bestehenden Render-PR-Previews bleiben aktiv; IONOS übernimmt die Release-Candidate- beziehungsweise Produktionsumgebung. Eine spätere Ablösung von Render ist eine separate, ausdrücklich zu entscheidende Betriebsänderung.</w:t>
       </w:r>
     </w:p>
     <w:p>
@@ -1278,12 +1278,12 @@
         <w:pStyle w:val="Heading2"/>
       </w:pPr>
       <w:r>
-        <w:t>Render Preview ablösen</w:t>
+        <w:t>Render-PR-Previews beibehalten</w:t>
       </w:r>
     </w:p>
     <w:p>
       <w:r>
-        <w:t>Die temporäre Render-Mock-Preview bis zur akzeptierten PostgreSQL-gestützten IONOS-Preview weiterbetreiben. Nach deren Abnahme die akzeptierte IONOS-URL und Prüfnachweise in #117 festhalten, Render-Blueprint und automatische PR-Previews entfernen, Render-Passworthash und Session-Secret entfernen oder rotieren und prüfen, dass keine DNS-Einträge mehr auf Render zeigen. Das Datum und die Änderung in render-previews.md nachtragen. Die Abschaltung ist eine Betriebsänderung und gehört nicht zum Abschluss der Entwicklungsvorlage #105.</w:t>
+        <w:t>Die bestehende Render-Mock-Preview und die automatischen PR-Previews bleiben aktiv. IONOS stellt die Release-Candidate- und Produktionsumgebung bereit; die dafür nötigen Nachweise werden in #117 festgehalten. Render-Blueprint, PR-Preview-Service, Preview-Passworthash und Session-Secret dürfen im Rahmen von #117 nicht entfernt oder deaktiviert werden. Eine spätere Ablösung von Render braucht eine eigene Entscheidung, ein eigenes Issue und einen dokumentierten Migrations- beziehungsweise Rollback-Plan. Den Status beider Hosting-Pfade in render-previews.md synchron halten.</w:t>
       </w:r>
     </w:p>
     <w:p>

</xml_diff>

<commit_message>
docs: configure persistent import staging
</commit_message>
<xml_diff>
--- a/docs/replacement-app/deployment/handbuch.docx
+++ b/docs/replacement-app/deployment/handbuch.docx
@@ -15,7 +15,7 @@
         <w:spacing w:after="200"/>
       </w:pPr>
       <w:r>
-        <w:t>Schrittweise Anleitung für die erstmalige Bereitstellung und den späteren Betrieb der Replacement App auf einem IONOS Server. Die drei Kapitel unterscheiden Installationsschritte, externe Entscheidungen und Laufzeitkonfiguration sowie den laufenden Betrieb. Stand 20. September 2026.</w:t>
+        <w:t>Schrittweise Anleitung für die erstmalige Bereitstellung und den späteren Betrieb der Replacement App auf einem IONOS Server. Die drei Kapitel unterscheiden Installationsschritte, externe Entscheidungen und Laufzeitkonfiguration sowie den laufenden Betrieb. Stand 22. September 2026.</w:t>
       </w:r>
     </w:p>
     <w:p>
@@ -196,7 +196,7 @@
     </w:p>
     <w:p>
       <w:r>
-        <w:t>Die fünf Beispiel-Umgebungsdateien kopieren, Domains, ACME-Kontakt, unterschiedliche Datenbank-Passwörter und Preview-Zugangsschutz nach „Konfiguration“ eintragen. Die Dateien bleiben auf dem Server und werden nicht committet. Vor dem Start müssen Preview- und Produktions-Datenbankpasswörter jeweils zwischen POSTGRES_PASSWORD und DATABASE_URL übereinstimmen.</w:t>
+        <w:t>Die fünf Beispiel-Umgebungsdateien kopieren, Domains, ACME-Kontakt, unterschiedliche Datenbank-Passwörter, Preview-Zugangsschutz und je Umgebung einen Import-Token-Hash nach „Konfiguration“ eintragen. Die Dateien bleiben auf dem Server und werden nicht committet. Vor dem Start müssen Preview- und Produktions-Datenbankpasswörter jeweils zwischen POSTGRES_PASSWORD und DATABASE_URL übereinstimmen. Die Klartext-Import-Tokens werden getrennt und sicher an den Converter-Arbeitsplatz übergeben; sie gehören nicht auf den Server oder in das Repository.</w:t>
       </w:r>
     </w:p>
     <w:p>
@@ -259,7 +259,7 @@
         <w:keepNext/>
       </w:pPr>
       <w:r>
-        <w:t>Preview und Produktion haben getrennte Datenbanken, Volumes und interne Netzwerke. Zuerst nur die Datenbanken starten, dann die Migration für jede Umgebung ausführen:</w:t>
+        <w:t>Preview und Produktion haben getrennte Datenbanken, Import-Staging-Volumes und interne Netzwerke. Zuerst nur die Datenbanken starten, dann die Migration für jede Umgebung ausführen:</w:t>
       </w:r>
     </w:p>
     <w:p>
@@ -321,7 +321,7 @@
         <w:keepNext/>
       </w:pPr>
       <w:r>
-        <w:t>Der Erstimport nutzt den bereits vorhandenen Operator-Weg. Vor jedem schreibenden Lauf den vollständigen Snapshot und den sync-Bericht prüfen. Der in db:dry-run ausgegebene Manifest-Checksum muss exakt beim zugehörigen db:apply eingesetzt werden; CHECKSUM ist ein Platzhalter:</w:t>
+        <w:t>Der Erstimport kann den bereits vorhandenen Operator-Weg verwenden. Vor jedem schreibenden Lauf den vollständigen Snapshot und den sync-Bericht prüfen. Der in db:dry-run ausgegebene Manifest-Checksum muss exakt beim zugehörigen db:apply eingesetzt werden; CHECKSUM ist ein Platzhalter:</w:t>
       </w:r>
     </w:p>
     <w:p>
@@ -367,7 +367,7 @@
     </w:p>
     <w:p>
       <w:r>
-        <w:t>Preview und Produktion können unterschiedliche Checksum-Werte nur dann haben, wenn absichtlich unterschiedliche Dateien verwendet werden; für die M1-Abnahme ist der freigegebene Datenstand je Umgebung nachzuweisen. Vor apply die Anzahl der Inserts, Änderungen und Entfernungen, Warnungen und die Quell-Dateien kontrollieren. Berichte liegen unter deploy/ionos/reports/preview und deploy/ionos/reports/production. Für Importdetails gilt packages/database/README.md. Der gesicherte dauerhafte Importweg aus #107 bleibt ein eigenes M1-Produkt-Issue.</w:t>
+        <w:t>Preview und Produktion können unterschiedliche Checksum-Werte nur dann haben, wenn absichtlich unterschiedliche Dateien verwendet werden; für die M1-Abnahme ist der freigegebene Datenstand je Umgebung nachzuweisen. Vor apply die Anzahl der Inserts, Änderungen und Entfernungen, Warnungen und die Quell-Dateien kontrollieren. Berichte liegen unter deploy/ionos/reports/preview und deploy/ionos/reports/production. Für Importdetails gilt packages/database/README.md. Nach Integration von PR #121 wird derselbe fachliche Dry-Run- und Apply-Ablauf über die gesicherte API aus dem Converter ausgelöst; der Operator-Weg bleibt für Erstinbetriebnahme und Wiederherstellung verfügbar.</w:t>
       </w:r>
     </w:p>
     <w:p>
@@ -465,6 +465,11 @@
       </w:r>
     </w:p>
     <w:p>
+      <w:r>
+        <w:t>Zusätzlich mit dem Converter je Umgebung einen autorisierten API-Dry-Run durchführen, die zurückgegebenen Dateianzahlen, Prüfsumme und Diagnosen prüfen und erst danach einen ausdrücklich bestätigten Apply auslösen. Ein Request ohne Token muss mit 401 abgewiesen werden. Nach erfolgreichem Apply eine repräsentative öffentliche Seite neu laden und den Datensatz prüfen. Run-Status, Audit-Ereignisse und die Bereinigung des Staging-Verzeichnisses ohne Secret-Werte in #117 dokumentieren.</w:t>
+      </w:r>
+    </w:p>
+    <w:p>
       <w:pPr>
         <w:pStyle w:val="Heading2"/>
       </w:pPr>
@@ -487,7 +492,7 @@
     </w:p>
     <w:p>
       <w:r>
-        <w:t>Dieses Kapitel trennt externe Voraussetzungen von Konfigurationsarbeit und fehlender Produktimplementierung. Stand 20. September 2026 sind in #117 noch keine konkreten IONOS-Werte als bestätigt dokumentiert. Die Übersicht ist eine Arbeitsliste für die reale Inbetriebnahme, keine Liste von Programmierfehlern. Echte Zugangsdaten dürfen nur in einem geeigneten Secret-Speicher und in den geschützten Serverdateien stehen, niemals hier.</w:t>
+        <w:t>Dieses Kapitel trennt externe Voraussetzungen von Konfigurationsarbeit und fehlender Produktimplementierung. Stand 22. September 2026 sind in #117 noch keine konkreten IONOS-Werte als bestätigt dokumentiert. Die Übersicht ist eine Arbeitsliste für die reale Inbetriebnahme, keine Liste von Programmierfehlern. Echte Zugangsdaten dürfen nur in einem geeigneten Secret-Speicher und in den geschützten Serverdateien stehen, niemals hier.</w:t>
       </w:r>
     </w:p>
     <w:p>
@@ -800,7 +805,7 @@
         <w:rPr>
           <w:sz w:val="18"/>
         </w:rPr>
-        <w:t>Produktimplementierung #107  ·  #105: Eigenes Ticket  ·  #117: M1 insgesamt</w:t>
+        <w:t>Produktimplementierung #107 und Laufzeitkonfiguration  ·  #105: Staging-Volume und Vorlagen  ·  #117: Ja</w:t>
       </w:r>
     </w:p>
     <w:p>
@@ -810,7 +815,7 @@
         <w:ind w:left="216"/>
       </w:pPr>
       <w:r>
-        <w:t>Nicht durch Serverkonfiguration ersetzbar</w:t>
+        <w:t>Code aus PR #121 deployen, Token erzeugen, Hash eintragen und End-to-End-Test dokumentieren</w:t>
       </w:r>
     </w:p>
     <w:p>
@@ -885,7 +890,7 @@
     </w:p>
     <w:p>
       <w:r>
-        <w:t>Die ersten acht Zeilen blockieren einen realen Serverstart oder eine verantwortbare Live-Schaltung, nicht den Abschluss der Code-Vorlage in #105. Der Import per Operator-Kommando ist für die Erstinbetriebnahme vorhanden; der dauerhafte gesicherte Produktworkflow bleibt #107. Wiederkehrende Backups gehören zu #79 in M4 und sind nicht stillschweigend Teil dieser M1-Konfiguration.</w:t>
+        <w:t>Die ersten acht Zeilen blockieren einen realen Serverstart oder eine verantwortbare Live-Schaltung, nicht den Abschluss der Code-Vorlage in #105. Der Import per Operator-Kommando bleibt für Erstinbetriebnahme und Wiederherstellung vorhanden. Der gesicherte Produktworkflow wird durch #107 beziehungsweise PR #121 geliefert und benötigt bei der Bereitstellung zusätzlich die unten beschriebene Laufzeitkonfiguration. Wiederkehrende Backups gehören zu #79 in M4 und sind nicht stillschweigend Teil dieser M1-Konfiguration.</w:t>
       </w:r>
     </w:p>
     <w:p>
@@ -1029,12 +1034,35 @@
         <w:pStyle w:val="Heading2"/>
       </w:pPr>
       <w:r>
+        <w:t>Import API und Staging Volume</w:t>
+      </w:r>
+    </w:p>
+    <w:p>
+      <w:r>
+        <w:t>Preview und Produktion besitzen jeweils ein eigenes benanntes Docker-Volume, das ausschließlich unter /var/lib/aad/import-staging in den ansonsten schreibgeschützten App-Container eingehängt wird. IMPORT_STAGING_ROOT muss exakt auf diesen Pfad zeigen. Das Volume hält den geprüften Upload zwischen Dry-Run und Apply beziehungsweise einem sicheren Wiederholungsversuch. Es ist weder die kanonische Datenbank noch ein Backup und darf nicht zwischen Preview und Produktion geteilt werden.</w:t>
+      </w:r>
+    </w:p>
+    <w:p>
+      <w:r>
+        <w:t>In beiden App-Dateien wird die API mit IMPORT_API_ENABLED=true ausdrücklich aktiviert. IMPORT_API_TOKEN_HASH enthält nur den Scrypt-Hash eines je Umgebung eigenen, zufälligen Import-Tokens. Den Hash im Web-Paket mit AAD_IMPORT_API_TOKEN='&lt;zufälliger Wert&gt;' npm run import:hash-token erzeugen. Der Klartextwert gehört ausschließlich in die geschützte Laufzeitumgebung des Converter-Arbeitsplatzes als AAD_IMPORT_API_TOKEN; dort steht zusätzlich die jeweilige Basis-URL als AAD_IMPORT_API_URL. Hash und Klartext dürfen nicht verwechselt, committet oder in Tickets, Screenshots und Diagnoseberichten abgelegt werden.</w:t>
+      </w:r>
+    </w:p>
+    <w:p>
+      <w:r>
+        <w:t>IMPORT_MAX_UPLOAD_BYTES, IMPORT_MAX_FILES und IMPORT_RUN_TTL_SECONDS begrenzen Upload und Lebensdauer. Die Vorlagen verwenden 25 MiB, 128 Dateien und 24 Stunden. Änderungen müssen zur realen Datenmenge passen und in #117 begründet werden. Abgelaufene oder erfolgreich angewendete Staging-Daten können entfernt werden; eine Bereinigung darf niemals das PostgreSQL-Volume betreffen.</w:t>
+      </w:r>
+    </w:p>
+    <w:p>
+      <w:pPr>
+        <w:pStyle w:val="Heading2"/>
+      </w:pPr>
+      <w:r>
         <w:t>Konfigurationsprüfung vor dem Start</w:t>
       </w:r>
     </w:p>
     <w:p>
       <w:r>
-        <w:t>docker compose config --quiet muss erfolgreich sein. Zusätzlich alle Umgebungsdateien auf Platzhalter, getrennte Passwörter, passende DATABASE_URL-Werte, korrekte Domains und Dateirechte prüfen. Nicht die vollständige Ausgabe von docker compose config in ein öffentliches Ticket kopieren: je nach Compose-Version können darin Geheimnisse erscheinen. Die technischen Einzelheiten der Importdateien stehen in packages/database/README.md.</w:t>
+        <w:t>docker compose config --quiet muss erfolgreich sein. Zusätzlich alle Umgebungsdateien auf Platzhalter, getrennte Passwörter und Import-Tokens, passende DATABASE_URL-Werte, korrekte Domains, Staging-Pfade und Dateirechte prüfen. Nicht die vollständige Ausgabe von docker compose config in ein öffentliches Ticket kopieren: je nach Compose-Version können darin Geheimnisse erscheinen. Die technischen Einzelheiten der Importdateien stehen in packages/database/README.md; API-Vertrag und lokaler Testablauf stehen in import-api.md.</w:t>
       </w:r>
     </w:p>
     <w:p>
@@ -1271,6 +1299,24 @@
     <w:p>
       <w:r>
         <w:t>Vor einem Wiederaufbau den Vorfall sichern, betroffene Umgebung und exakten Volume-Namen mit einer zweiten Person prüfen und den zu verwendenden Snapshot freigeben. Dann die betroffene App stoppen, ausschließlich das ausdrücklich bestätigte Datenbankvolume entfernen, Datenbank neu starten, Migration ausführen, Dry-Run-Bericht prüfen, Checksum freigeben und CSVs anwenden. Danach App starten und Health, Mengen, Beziehungen und Stichproben prüfen. Ein pauschaler Löschbefehl steht absichtlich nicht in diesem Handbuch. Wiederkehrende Backups, Aufbewahrung und ein getesteter Restore bleiben #79 / Kunden-M4.</w:t>
+      </w:r>
+    </w:p>
+    <w:p>
+      <w:pPr>
+        <w:pStyle w:val="Heading2"/>
+      </w:pPr>
+      <w:r>
+        <w:t>Gesicherte Importe betreiben</w:t>
+      </w:r>
+    </w:p>
+    <w:p>
+      <w:r>
+        <w:t>Ein regulärer Datenimport beginnt im Converter mit einem vollständigen lokalen Lauf. Anschließend sendet die verantwortliche Person einen Dry-Run an die gewählte Umgebung, prüft Prüfsumme, Diagnosen sowie eingefügte, geänderte und entfernte Datensätze und bestätigt Apply getrennt. Preview und Produktion verwenden unterschiedliche Basis-URLs, Tokens, Datenbanken und Staging-Volumes. Ein Preview-Run darf nicht in Produktion angewendet werden.</w:t>
+      </w:r>
+    </w:p>
+    <w:p>
+      <w:r>
+        <w:t>Bei einer unsicheren Netzwerkantwort nach Apply nicht mit einem neuen Upload fortfahren. Zuerst den bestehenden Run-Status über die API beziehungsweise die Tabellen import_runs, import_files und audit_events prüfen und denselben Run idempotent wiederholen. Ein erfolgreicher Apply entfernt die Staging-Dateien und aktualisiert die öffentlichen Leseansichten; Metadaten und Audit-Ereignisse bleiben in PostgreSQL. Fehlgeschlagene oder abgelaufene Runs dürfen bereinigt werden, nachdem Ursache und benötigte Diagnoseinformationen gesichert sind. Import-Tokens niemals in Logs oder Support-Tickets kopieren; bei Verdacht auf Offenlegung neues Token und neuen Hash konfigurieren und die App kontrolliert neu starten.</w:t>
       </w:r>
     </w:p>
     <w:p>

</xml_diff>